<commit_message>
updating user guide - final
</commit_message>
<xml_diff>
--- a/documentation/Individual_SummarySheet.docx
+++ b/documentation/Individual_SummarySheet.docx
@@ -44,6 +44,84 @@
           <w:tcPr>
             <w:tcW w:w="7385" w:type="dxa"/>
           </w:tcPr>
+          <w:p>
+            <w:r>
+              <w:t>Matthew Cargill</w:t>
+            </w:r>
+          </w:p>
+        </w:tc>
+      </w:tr>
+      <w:tr>
+        <w:tc>
+          <w:tcPr>
+            <w:tcW w:w="1965" w:type="dxa"/>
+          </w:tcPr>
+          <w:p>
+            <w:pPr>
+              <w:rPr>
+                <w:b/>
+                <w:bCs/>
+              </w:rPr>
+            </w:pPr>
+            <w:r>
+              <w:rPr>
+                <w:b/>
+                <w:bCs/>
+              </w:rPr>
+              <w:t>Thread:</w:t>
+            </w:r>
+          </w:p>
+        </w:tc>
+        <w:tc>
+          <w:tcPr>
+            <w:tcW w:w="7385" w:type="dxa"/>
+          </w:tcPr>
+          <w:p>
+            <w:r>
+              <w:t>Sensing and Exploration</w:t>
+            </w:r>
+          </w:p>
+        </w:tc>
+      </w:tr>
+      <w:tr>
+        <w:tc>
+          <w:tcPr>
+            <w:tcW w:w="1965" w:type="dxa"/>
+          </w:tcPr>
+          <w:p>
+            <w:pPr>
+              <w:rPr>
+                <w:b/>
+                <w:bCs/>
+              </w:rPr>
+            </w:pPr>
+            <w:r>
+              <w:rPr>
+                <w:b/>
+                <w:bCs/>
+              </w:rPr>
+              <w:t>Brief Project Description (2-3 sentences):</w:t>
+            </w:r>
+          </w:p>
+        </w:tc>
+        <w:tc>
+          <w:tcPr>
+            <w:tcW w:w="7385" w:type="dxa"/>
+          </w:tcPr>
+          <w:p/>
+          <w:p>
+            <w:r>
+              <w:t xml:space="preserve">This project is a wearable-free, privacy-preserving fall detection system designed for elderly individuals. It uses a combination of vibration sensing, acoustic sensing, and Wi-Fi CSI to detect motion, sound, and floor vibrations associated with </w:t>
+            </w:r>
+            <w:proofErr w:type="gramStart"/>
+            <w:r>
+              <w:t>a fall</w:t>
+            </w:r>
+            <w:proofErr w:type="gramEnd"/>
+            <w:r>
+              <w:t>. By integrating multiple sensing modalities, the system improves reliability compared to single-sensor approaches.</w:t>
+            </w:r>
+          </w:p>
           <w:p/>
         </w:tc>
       </w:tr>
@@ -64,7 +142,7 @@
                 <w:b/>
                 <w:bCs/>
               </w:rPr>
-              <w:t>Thread:</w:t>
+              <w:t>On-campus Resources used (Makerspaces, Instructional Labs)</w:t>
             </w:r>
           </w:p>
         </w:tc>
@@ -72,6 +150,46 @@
           <w:tcPr>
             <w:tcW w:w="7385" w:type="dxa"/>
           </w:tcPr>
+          <w:p/>
+          <w:p/>
+          <w:p>
+            <w:r>
+              <w:t>The Hive Makerspace</w:t>
+            </w:r>
+          </w:p>
+        </w:tc>
+      </w:tr>
+      <w:tr>
+        <w:tc>
+          <w:tcPr>
+            <w:tcW w:w="1965" w:type="dxa"/>
+          </w:tcPr>
+          <w:p>
+            <w:pPr>
+              <w:rPr>
+                <w:b/>
+                <w:bCs/>
+              </w:rPr>
+            </w:pPr>
+            <w:r>
+              <w:rPr>
+                <w:b/>
+                <w:bCs/>
+              </w:rPr>
+              <w:t>Relation to thread (1-2 sentences):</w:t>
+            </w:r>
+          </w:p>
+        </w:tc>
+        <w:tc>
+          <w:tcPr>
+            <w:tcW w:w="7385" w:type="dxa"/>
+          </w:tcPr>
+          <w:p/>
+          <w:p>
+            <w:r>
+              <w:t>This project directly aligns with the Sensing and Exploration thread by incorporating multiple sensing modalities, including Wi-Fi, vibration, and acoustic signals. It also applies sensor fusion techniques to interpret noisy data and improve fall detection accuracy.</w:t>
+            </w:r>
+          </w:p>
           <w:p/>
         </w:tc>
       </w:tr>
@@ -92,7 +210,7 @@
                 <w:b/>
                 <w:bCs/>
               </w:rPr>
-              <w:t>Brief Project Description (2-3 sentences):</w:t>
+              <w:t>Why did you choose this project?</w:t>
             </w:r>
           </w:p>
         </w:tc>
@@ -101,96 +219,23 @@
             <w:tcW w:w="7385" w:type="dxa"/>
           </w:tcPr>
           <w:p/>
-          <w:p/>
-          <w:p/>
-          <w:p/>
-          <w:p/>
-        </w:tc>
-      </w:tr>
-      <w:tr>
-        <w:tc>
-          <w:tcPr>
-            <w:tcW w:w="1965" w:type="dxa"/>
-          </w:tcPr>
           <w:p>
-            <w:pPr>
-              <w:rPr>
-                <w:b/>
-                <w:bCs/>
-              </w:rPr>
-            </w:pPr>
-            <w:r>
-              <w:rPr>
-                <w:b/>
-                <w:bCs/>
-              </w:rPr>
-              <w:t>On-campus Resources used (Makerspaces, Instructional Labs)</w:t>
+            <w:r>
+              <w:t xml:space="preserve">I have known several relatives/friends who were seriously injured/died because of falls – it is important for them to get help as fast as possible. Additionally, </w:t>
+            </w:r>
+            <w:r>
+              <w:t>my grandmother often refused to wear her Life Alert device, so I saw firsthand the difficulties of wearable solutions</w:t>
+            </w:r>
+            <w:r>
+              <w:t>.</w:t>
+            </w:r>
+            <w:r>
+              <w:t xml:space="preserve"> </w:t>
+            </w:r>
+            <w:r>
+              <w:t>I was also interested in exploring Wi-Fi sensing, which was a new and intriguing area to me.</w:t>
             </w:r>
           </w:p>
-        </w:tc>
-        <w:tc>
-          <w:tcPr>
-            <w:tcW w:w="7385" w:type="dxa"/>
-          </w:tcPr>
-          <w:p/>
-        </w:tc>
-      </w:tr>
-      <w:tr>
-        <w:tc>
-          <w:tcPr>
-            <w:tcW w:w="1965" w:type="dxa"/>
-          </w:tcPr>
-          <w:p>
-            <w:pPr>
-              <w:rPr>
-                <w:b/>
-                <w:bCs/>
-              </w:rPr>
-            </w:pPr>
-            <w:r>
-              <w:rPr>
-                <w:b/>
-                <w:bCs/>
-              </w:rPr>
-              <w:t>Relation to thread (1-2 sentences):</w:t>
-            </w:r>
-          </w:p>
-        </w:tc>
-        <w:tc>
-          <w:tcPr>
-            <w:tcW w:w="7385" w:type="dxa"/>
-          </w:tcPr>
-          <w:p/>
-          <w:p/>
-        </w:tc>
-      </w:tr>
-      <w:tr>
-        <w:tc>
-          <w:tcPr>
-            <w:tcW w:w="1965" w:type="dxa"/>
-          </w:tcPr>
-          <w:p>
-            <w:pPr>
-              <w:rPr>
-                <w:b/>
-                <w:bCs/>
-              </w:rPr>
-            </w:pPr>
-            <w:r>
-              <w:rPr>
-                <w:b/>
-                <w:bCs/>
-              </w:rPr>
-              <w:t>Why did you choose this project?</w:t>
-            </w:r>
-          </w:p>
-        </w:tc>
-        <w:tc>
-          <w:tcPr>
-            <w:tcW w:w="7385" w:type="dxa"/>
-          </w:tcPr>
-          <w:p/>
-          <w:p/>
           <w:p/>
         </w:tc>
       </w:tr>
@@ -229,13 +274,25 @@
             <w:tcW w:w="7385" w:type="dxa"/>
           </w:tcPr>
           <w:p/>
+          <w:p>
+            <w:r>
+              <w:t>The project was completed successfully. The final system includes a soldered protoboard implementation housed in a 3D-printed enclosure. I also developed software to interface with the device and display a graphical dashboard showing presence detection, fall detection results, and event logs.</w:t>
+            </w:r>
+          </w:p>
           <w:p/>
-          <w:p/>
-          <w:p/>
-          <w:p/>
-          <w:p/>
-          <w:p/>
-          <w:p/>
+          <w:p>
+            <w:r>
+              <w:t xml:space="preserve">Testing demonstrated that the system </w:t>
+            </w:r>
+            <w:proofErr w:type="gramStart"/>
+            <w:r>
+              <w:t>can</w:t>
+            </w:r>
+            <w:proofErr w:type="gramEnd"/>
+            <w:r>
+              <w:t xml:space="preserve"> detect both falls and presence with reasonable accuracy. However, this remains a prototype, and performance could be further improved with more advanced signal processing and modeling techniques.</w:t>
+            </w:r>
+          </w:p>
           <w:p/>
           <w:p/>
         </w:tc>
@@ -979,7 +1036,6 @@
   <w:style w:type="character" w:default="1" w:styleId="DefaultParagraphFont">
     <w:name w:val="Default Paragraph Font"/>
     <w:uiPriority w:val="1"/>
-    <w:semiHidden/>
     <w:unhideWhenUsed/>
   </w:style>
   <w:style w:type="table" w:default="1" w:styleId="TableNormal">

</xml_diff>